<commit_message>
W9 and W10 done.
</commit_message>
<xml_diff>
--- a/Workshops/Workshop 9 - NHST & AIC/W9.docx
+++ b/Workshops/Workshop 9 - NHST & AIC/W9.docx
@@ -113,7 +113,7 @@
         <w:t xml:space="preserve"> </w:t>
       </w:r>
       <w:r>
-        <w:t xml:space="preserve">2024-08-27</w:t>
+        <w:t xml:space="preserve">2024-08-28</w:t>
       </w:r>
     </w:p>
     <w:sdt>
@@ -565,7 +565,7 @@
           <m:e>
             <m:phant>
               <m:phantPr>
-                <m:show m:val="off"/>
+                <m:show m:val="0"/>
               </m:phantPr>
               <m:e>
                 <m:r>
@@ -838,6 +838,206 @@
         <w:t xml:space="preserve">(butter_mod)</w:t>
       </w:r>
     </w:p>
+    <w:p>
+      <w:pPr>
+        <w:pStyle w:val="SourceCode"/>
+      </w:pPr>
+      <w:r>
+        <w:rPr>
+          <w:rStyle w:val="VerbatimChar"/>
+        </w:rPr>
+        <w:t xml:space="preserve">## </w:t>
+      </w:r>
+      <w:r>
+        <w:br/>
+      </w:r>
+      <w:r>
+        <w:rPr>
+          <w:rStyle w:val="VerbatimChar"/>
+        </w:rPr>
+        <w:t xml:space="preserve">## Call:</w:t>
+      </w:r>
+      <w:r>
+        <w:br/>
+      </w:r>
+      <w:r>
+        <w:rPr>
+          <w:rStyle w:val="VerbatimChar"/>
+        </w:rPr>
+        <w:t xml:space="preserve">## lm(formula = wing_length ~ body_length + glyphosate + habitat, </w:t>
+      </w:r>
+      <w:r>
+        <w:br/>
+      </w:r>
+      <w:r>
+        <w:rPr>
+          <w:rStyle w:val="VerbatimChar"/>
+        </w:rPr>
+        <w:t xml:space="preserve">##     data = butterfly)</w:t>
+      </w:r>
+      <w:r>
+        <w:br/>
+      </w:r>
+      <w:r>
+        <w:rPr>
+          <w:rStyle w:val="VerbatimChar"/>
+        </w:rPr>
+        <w:t xml:space="preserve">## </w:t>
+      </w:r>
+      <w:r>
+        <w:br/>
+      </w:r>
+      <w:r>
+        <w:rPr>
+          <w:rStyle w:val="VerbatimChar"/>
+        </w:rPr>
+        <w:t xml:space="preserve">## Residuals:</w:t>
+      </w:r>
+      <w:r>
+        <w:br/>
+      </w:r>
+      <w:r>
+        <w:rPr>
+          <w:rStyle w:val="VerbatimChar"/>
+        </w:rPr>
+        <w:t xml:space="preserve">##     Min      1Q  Median      3Q     Max </w:t>
+      </w:r>
+      <w:r>
+        <w:br/>
+      </w:r>
+      <w:r>
+        <w:rPr>
+          <w:rStyle w:val="VerbatimChar"/>
+        </w:rPr>
+        <w:t xml:space="preserve">## -5.5075 -1.3514 -0.1532  1.3206  6.0567 </w:t>
+      </w:r>
+      <w:r>
+        <w:br/>
+      </w:r>
+      <w:r>
+        <w:rPr>
+          <w:rStyle w:val="VerbatimChar"/>
+        </w:rPr>
+        <w:t xml:space="preserve">## </w:t>
+      </w:r>
+      <w:r>
+        <w:br/>
+      </w:r>
+      <w:r>
+        <w:rPr>
+          <w:rStyle w:val="VerbatimChar"/>
+        </w:rPr>
+        <w:t xml:space="preserve">## Coefficients:</w:t>
+      </w:r>
+      <w:r>
+        <w:br/>
+      </w:r>
+      <w:r>
+        <w:rPr>
+          <w:rStyle w:val="VerbatimChar"/>
+        </w:rPr>
+        <w:t xml:space="preserve">##                Estimate Std. Error t value Pr(&gt;|t|)    </w:t>
+      </w:r>
+      <w:r>
+        <w:br/>
+      </w:r>
+      <w:r>
+        <w:rPr>
+          <w:rStyle w:val="VerbatimChar"/>
+        </w:rPr>
+        <w:t xml:space="preserve">## (Intercept)    -1.22851    0.86517  -1.420 0.157216    </w:t>
+      </w:r>
+      <w:r>
+        <w:br/>
+      </w:r>
+      <w:r>
+        <w:rPr>
+          <w:rStyle w:val="VerbatimChar"/>
+        </w:rPr>
+        <w:t xml:space="preserve">## body_length     0.57689    0.02664  21.651  &lt; 2e-16 ***</w:t>
+      </w:r>
+      <w:r>
+        <w:br/>
+      </w:r>
+      <w:r>
+        <w:rPr>
+          <w:rStyle w:val="VerbatimChar"/>
+        </w:rPr>
+        <w:t xml:space="preserve">## glyphosate      0.03815    0.21457   0.178 0.859072    </w:t>
+      </w:r>
+      <w:r>
+        <w:br/>
+      </w:r>
+      <w:r>
+        <w:rPr>
+          <w:rStyle w:val="VerbatimChar"/>
+        </w:rPr>
+        <w:t xml:space="preserve">## habitatMeadow  -1.55103    0.33826  -4.585 8.09e-06 ***</w:t>
+      </w:r>
+      <w:r>
+        <w:br/>
+      </w:r>
+      <w:r>
+        <w:rPr>
+          <w:rStyle w:val="VerbatimChar"/>
+        </w:rPr>
+        <w:t xml:space="preserve">## habitatWetland -1.30916    0.33199  -3.943 0.000112 ***</w:t>
+      </w:r>
+      <w:r>
+        <w:br/>
+      </w:r>
+      <w:r>
+        <w:rPr>
+          <w:rStyle w:val="VerbatimChar"/>
+        </w:rPr>
+        <w:t xml:space="preserve">## ---</w:t>
+      </w:r>
+      <w:r>
+        <w:br/>
+      </w:r>
+      <w:r>
+        <w:rPr>
+          <w:rStyle w:val="VerbatimChar"/>
+        </w:rPr>
+        <w:t xml:space="preserve">## Signif. codes:  0 '***' 0.001 '**' 0.01 '*' 0.05 '.' 0.1 ' ' 1</w:t>
+      </w:r>
+      <w:r>
+        <w:br/>
+      </w:r>
+      <w:r>
+        <w:rPr>
+          <w:rStyle w:val="VerbatimChar"/>
+        </w:rPr>
+        <w:t xml:space="preserve">## </w:t>
+      </w:r>
+      <w:r>
+        <w:br/>
+      </w:r>
+      <w:r>
+        <w:rPr>
+          <w:rStyle w:val="VerbatimChar"/>
+        </w:rPr>
+        <w:t xml:space="preserve">## Residual standard error: 1.917 on 195 degrees of freedom</w:t>
+      </w:r>
+      <w:r>
+        <w:br/>
+      </w:r>
+      <w:r>
+        <w:rPr>
+          <w:rStyle w:val="VerbatimChar"/>
+        </w:rPr>
+        <w:t xml:space="preserve">## Multiple R-squared:  0.7245, Adjusted R-squared:  0.7189 </w:t>
+      </w:r>
+      <w:r>
+        <w:br/>
+      </w:r>
+      <w:r>
+        <w:rPr>
+          <w:rStyle w:val="VerbatimChar"/>
+        </w:rPr>
+        <w:t xml:space="preserve">## F-statistic: 128.2 on 4 and 195 DF,  p-value: &lt; 2.2e-16</w:t>
+      </w:r>
+    </w:p>
     <w:bookmarkEnd w:id="25"/>
     <w:bookmarkStart w:id="26" w:name="question-set-two"/>
     <w:p>
@@ -872,122 +1072,32 @@
     </w:p>
     <w:p>
       <w:pPr>
-        <w:pStyle w:val="SourceCode"/>
-      </w:pPr>
-      <w:r>
-        <w:rPr>
-          <w:rStyle w:val="CommentTok"/>
-        </w:rPr>
-        <w:t xml:space="preserve"># A parameter being statistically significant just means there is a 5% chance, or less, that the Estimate could be zero.</w:t>
-      </w:r>
-    </w:p>
-    <w:p>
-      <w:pPr>
         <w:numPr>
           <w:ilvl w:val="0"/>
-          <w:numId w:val="1004"/>
+          <w:numId w:val="1003"/>
         </w:numPr>
-        <w:pStyle w:val="Compact"/>
       </w:pPr>
       <w:r>
         <w:t xml:space="preserve">What does statistical significance mean for the three statistically significant parameters in our model?</w:t>
-      </w:r>
-    </w:p>
-    <w:p>
-      <w:pPr>
-        <w:pStyle w:val="SourceCode"/>
-      </w:pPr>
-      <w:r>
-        <w:rPr>
-          <w:rStyle w:val="CommentTok"/>
-        </w:rPr>
-        <w:t xml:space="preserve"># This is where understanding what the parameters actually are becomes really important.</w:t>
-      </w:r>
-      <w:r>
-        <w:br/>
-      </w:r>
-      <w:r>
-        <w:br/>
-      </w:r>
-      <w:r>
-        <w:rPr>
-          <w:rStyle w:val="CommentTok"/>
-        </w:rPr>
-        <w:t xml:space="preserve"># body_length describes how much wing length increases as body length increases. It's a slope (which we know because body length is continuous).</w:t>
-      </w:r>
-      <w:r>
-        <w:br/>
-      </w:r>
-      <w:r>
-        <w:rPr>
-          <w:rStyle w:val="CommentTok"/>
-        </w:rPr>
-        <w:t xml:space="preserve"># So NHST and P-values are simply asking, "could our body length slope be zero?". So for our body length slope, there's a tiny chance, according to P-values, that the slope is zero - the probability is less than 1%, nevermind 5%.</w:t>
-      </w:r>
-      <w:r>
-        <w:br/>
-      </w:r>
-      <w:r>
-        <w:br/>
-      </w:r>
-      <w:r>
-        <w:rPr>
-          <w:rStyle w:val="CommentTok"/>
-        </w:rPr>
-        <w:t xml:space="preserve"># habitatMeadow is a bit more complicated because it is one level in our categorical variable. Remember that with categorical variables, we use one as a reference point (here R has used Forest as the reference) and the Estimate is the difference between Forest and Meadows. Our model thinks butterflies in meadows have wings that are about 1 mm smaller compared to forest monarch butterflies.</w:t>
-      </w:r>
-      <w:r>
-        <w:br/>
-      </w:r>
-      <w:r>
-        <w:rPr>
-          <w:rStyle w:val="CommentTok"/>
-        </w:rPr>
-        <w:t xml:space="preserve"># The P-value is doing the same thing, it's asking "could the difference between forests and meadow butterflies be zero?". The actual probability it calculates is 0.03% (0.000339 * 100), again well below our 5% threshold.</w:t>
-      </w:r>
-      <w:r>
-        <w:br/>
-      </w:r>
-      <w:r>
-        <w:br/>
-      </w:r>
-      <w:r>
-        <w:rPr>
-          <w:rStyle w:val="CommentTok"/>
-        </w:rPr>
-        <w:t xml:space="preserve"># habitatWetland is the exact same as for habitatMeadow. It is asking if the difference to *Forest* is zero or not.</w:t>
       </w:r>
     </w:p>
     <w:p>
       <w:pPr>
         <w:numPr>
           <w:ilvl w:val="0"/>
-          <w:numId w:val="1005"/>
+          <w:numId w:val="1003"/>
         </w:numPr>
-        <w:pStyle w:val="Compact"/>
       </w:pPr>
       <w:r>
         <w:t xml:space="preserve">What does statistical significance (or the lack thereof) mean for an intercept?</w:t>
-      </w:r>
-    </w:p>
-    <w:p>
-      <w:pPr>
-        <w:pStyle w:val="SourceCode"/>
-      </w:pPr>
-      <w:r>
-        <w:rPr>
-          <w:rStyle w:val="CommentTok"/>
-        </w:rPr>
-        <w:t xml:space="preserve"># P-values in models always asks the same thing: "is this number (i.e. parameter estiamte) different to zero?". Statistical significance just adds: "is the probability that the parameter is different to zero less than a 5% chance?".</w:t>
       </w:r>
     </w:p>
     <w:p>
       <w:pPr>
         <w:numPr>
           <w:ilvl w:val="0"/>
-          <w:numId w:val="1006"/>
+          <w:numId w:val="1003"/>
         </w:numPr>
-        <w:pStyle w:val="Compact"/>
       </w:pPr>
       <w:r>
         <w:t xml:space="preserve">What does statistical significance (or the lack thereof) mean for</w:t>
@@ -1007,92 +1117,6 @@
       </w:r>
       <w:r>
         <w:t xml:space="preserve">intercept?</w:t>
-      </w:r>
-    </w:p>
-    <w:p>
-      <w:pPr>
-        <w:pStyle w:val="SourceCode"/>
-      </w:pPr>
-      <w:r>
-        <w:rPr>
-          <w:rStyle w:val="CommentTok"/>
-        </w:rPr>
-        <w:t xml:space="preserve"># Again, this is where we need to know what the parameter represents in order to make any kind of sensible interpretation of the P-value. </w:t>
-      </w:r>
-      <w:r>
-        <w:br/>
-      </w:r>
-      <w:r>
-        <w:br/>
-      </w:r>
-      <w:r>
-        <w:rPr>
-          <w:rStyle w:val="CommentTok"/>
-        </w:rPr>
-        <w:t xml:space="preserve"># Our intercept is where body length is zero (i.e. a butterfly that is zero mm long - basically, it doesn't exist) that is present in our reference level of our categorical variable (Forest for this model).</w:t>
-      </w:r>
-      <w:r>
-        <w:br/>
-      </w:r>
-      <w:r>
-        <w:rPr>
-          <w:rStyle w:val="CommentTok"/>
-        </w:rPr>
-        <w:t xml:space="preserve"># More simply, the intercept is; "The wing length of a butterfly that is 0 mm long and lives in a forest"</w:t>
-      </w:r>
-      <w:r>
-        <w:br/>
-      </w:r>
-      <w:r>
-        <w:rPr>
-          <w:rStyle w:val="CommentTok"/>
-        </w:rPr>
-        <w:t xml:space="preserve"># So the P-value for our intercept is asking:</w:t>
-      </w:r>
-      <w:r>
-        <w:br/>
-      </w:r>
-      <w:r>
-        <w:rPr>
-          <w:rStyle w:val="CommentTok"/>
-        </w:rPr>
-        <w:t xml:space="preserve"># "Is the wing length of a butterfly that is zero mm long and lives in a Forest, different from zero mm?"</w:t>
-      </w:r>
-      <w:r>
-        <w:br/>
-      </w:r>
-      <w:r>
-        <w:br/>
-      </w:r>
-      <w:r>
-        <w:rPr>
-          <w:rStyle w:val="CommentTok"/>
-        </w:rPr>
-        <w:t xml:space="preserve"># This is a rediculous statement. Why would we ever care if the wing length of a butterfly that's body is zero mm long and lives in a forest, is different from zero? Well, we only "care" about this parameter in the sense that we need it to draw a line, or show differences between habitats. So it's an important *parameter* but we don't care what the actual value is, per se, nor do wee care if it's different to zero or not.</w:t>
-      </w:r>
-      <w:r>
-        <w:br/>
-      </w:r>
-      <w:r>
-        <w:br/>
-      </w:r>
-      <w:r>
-        <w:rPr>
-          <w:rStyle w:val="CommentTok"/>
-        </w:rPr>
-        <w:t xml:space="preserve"># In many (but not) models, if you're using NHST, you won't care about the intercept's P-value. For example, if you were modelling childrens height as a function of their age (height ~ age), the intercept would be the average childs height when they are born. The hypothesis, in NHST, would be the equivalent to saying you think that it's possible that children could be 0 cm tall when they're born. You don't need a P-value to know that's not true.</w:t>
-      </w:r>
-      <w:r>
-        <w:br/>
-      </w:r>
-      <w:r>
-        <w:br/>
-      </w:r>
-      <w:r>
-        <w:rPr>
-          <w:rStyle w:val="CommentTok"/>
-        </w:rPr>
-        <w:t xml:space="preserve"># There are instances where that's also true for other parameters. Keep in mind that you need to consider the "Null hypothesis" to be a sensible possibility, in order for "statistical significance" to actually mean anything. For example, do you think it's a legitimate biological hypothesis to assume that human children grow zero cm every year? If not, then NHST will just tell you something you already knew and claiming "statistical significance" is just performative.</w:t>
       </w:r>
     </w:p>
     <w:bookmarkEnd w:id="26"/>
@@ -1192,26 +1216,6 @@
           <w:rStyle w:val="NormalTok"/>
         </w:rPr>
         <w:t xml:space="preserve">(butter_mod)</w:t>
-      </w:r>
-    </w:p>
-    <w:p>
-      <w:pPr>
-        <w:pStyle w:val="SourceCode"/>
-      </w:pPr>
-      <w:r>
-        <w:rPr>
-          <w:rStyle w:val="VerbatimChar"/>
-        </w:rPr>
-        <w:t xml:space="preserve">## Warning: not plotting observations with leverage one:</w:t>
-      </w:r>
-      <w:r>
-        <w:br/>
-      </w:r>
-      <w:r>
-        <w:rPr>
-          <w:rStyle w:val="VerbatimChar"/>
-        </w:rPr>
-        <w:t xml:space="preserve">##   46</w:t>
       </w:r>
     </w:p>
     <w:p>
@@ -1331,7 +1335,7 @@
         <w:pStyle w:val="FirstParagraph"/>
       </w:pPr>
       <w:r>
-        <w:t xml:space="preserve">Everything looks pretty good with our diagnostics.</w:t>
+        <w:t xml:space="preserve">Everything should look good but if you find any issues, investigate and see if you can resolve it. As a hint, there is a data entry mistake that you might have missed while doing EDA.</w:t>
       </w:r>
     </w:p>
     <w:bookmarkEnd w:id="31"/>
@@ -1379,7 +1383,7 @@
       <w:pPr>
         <w:numPr>
           <w:ilvl w:val="0"/>
-          <w:numId w:val="1007"/>
+          <w:numId w:val="1004"/>
         </w:numPr>
       </w:pPr>
       <w:r>
@@ -1405,7 +1409,7 @@
       <w:pPr>
         <w:numPr>
           <w:ilvl w:val="0"/>
-          <w:numId w:val="1007"/>
+          <w:numId w:val="1004"/>
         </w:numPr>
       </w:pPr>
       <w:r>
@@ -1440,7 +1444,7 @@
       <w:pPr>
         <w:numPr>
           <w:ilvl w:val="0"/>
-          <w:numId w:val="1007"/>
+          <w:numId w:val="1004"/>
         </w:numPr>
       </w:pPr>
       <w:r>
@@ -1475,7 +1479,7 @@
       <w:pPr>
         <w:numPr>
           <w:ilvl w:val="0"/>
-          <w:numId w:val="1007"/>
+          <w:numId w:val="1004"/>
         </w:numPr>
       </w:pPr>
       <w:r>
@@ -1501,7 +1505,7 @@
       <w:pPr>
         <w:numPr>
           <w:ilvl w:val="0"/>
-          <w:numId w:val="1007"/>
+          <w:numId w:val="1004"/>
         </w:numPr>
       </w:pPr>
       <w:r>
@@ -1536,7 +1540,7 @@
       <w:pPr>
         <w:numPr>
           <w:ilvl w:val="0"/>
-          <w:numId w:val="1007"/>
+          <w:numId w:val="1004"/>
         </w:numPr>
       </w:pPr>
       <w:r>
@@ -1571,7 +1575,7 @@
       <w:pPr>
         <w:numPr>
           <w:ilvl w:val="0"/>
-          <w:numId w:val="1007"/>
+          <w:numId w:val="1004"/>
         </w:numPr>
       </w:pPr>
       <w:r>
@@ -1597,7 +1601,7 @@
       <w:pPr>
         <w:numPr>
           <w:ilvl w:val="0"/>
-          <w:numId w:val="1007"/>
+          <w:numId w:val="1004"/>
         </w:numPr>
       </w:pPr>
       <w:r>
@@ -1632,7 +1636,7 @@
       <w:pPr>
         <w:numPr>
           <w:ilvl w:val="0"/>
-          <w:numId w:val="1007"/>
+          <w:numId w:val="1004"/>
         </w:numPr>
       </w:pPr>
       <w:r>
@@ -4552,7 +4556,7 @@
       </w:r>
     </w:p>
     <w:bookmarkEnd w:id="41"/>
-    <w:bookmarkStart w:id="42" w:name="interpret-and-provide-inferences."/>
+    <w:bookmarkStart w:id="43" w:name="interpret-and-provide-inferences."/>
     <w:p>
       <w:pPr>
         <w:pStyle w:val="Heading1"/>
@@ -4566,7 +4570,98 @@
         <w:pStyle w:val="FirstParagraph"/>
       </w:pPr>
       <w:r>
-        <w:t xml:space="preserve">The statistical significance is maybe a bit clearer now. The slope for</w:t>
+        <w:t xml:space="preserve">In terms of the scientific question, what have we learnt?</w:t>
+      </w:r>
+    </w:p>
+    <w:bookmarkStart w:id="42" w:name="question-set-three"/>
+    <w:p>
+      <w:pPr>
+        <w:pStyle w:val="Heading2"/>
+      </w:pPr>
+      <w:r>
+        <w:t xml:space="preserve">Question Set Three</w:t>
+      </w:r>
+    </w:p>
+    <w:p>
+      <w:pPr>
+        <w:numPr>
+          <w:ilvl w:val="0"/>
+          <w:numId w:val="1005"/>
+        </w:numPr>
+      </w:pPr>
+      <w:r>
+        <w:t xml:space="preserve">What happens to wing length as body length increases?</w:t>
+      </w:r>
+    </w:p>
+    <w:p>
+      <w:pPr>
+        <w:numPr>
+          <w:ilvl w:val="0"/>
+          <w:numId w:val="1005"/>
+        </w:numPr>
+      </w:pPr>
+      <w:r>
+        <w:t xml:space="preserve">In which habitat do Monarch butterflies have the longest wings?</w:t>
+      </w:r>
+    </w:p>
+    <w:p>
+      <w:pPr>
+        <w:numPr>
+          <w:ilvl w:val="0"/>
+          <w:numId w:val="1005"/>
+        </w:numPr>
+      </w:pPr>
+      <w:r>
+        <w:t xml:space="preserve">Why might wings be smaller in some habitats compared to others?</w:t>
+      </w:r>
+    </w:p>
+    <w:p>
+      <w:pPr>
+        <w:pStyle w:val="SourceCode"/>
+      </w:pPr>
+      <w:r>
+        <w:rPr>
+          <w:rStyle w:val="CommentTok"/>
+        </w:rPr>
+        <w:t xml:space="preserve"># This is where we need some biological knowledge of the system. Monarch butterflies are reliant on milkweed plants, which are killed off by herbicides. Milkweeds are going to be more common in meadows (and farmlands), so that could be a reason, but we're speculating with this result.</w:t>
+      </w:r>
+    </w:p>
+    <w:p>
+      <w:pPr>
+        <w:numPr>
+          <w:ilvl w:val="0"/>
+          <w:numId w:val="1006"/>
+        </w:numPr>
+      </w:pPr>
+      <w:r>
+        <w:t xml:space="preserve">Does glyphosate effect wing length?</w:t>
+      </w:r>
+    </w:p>
+    <w:p>
+      <w:pPr>
+        <w:numPr>
+          <w:ilvl w:val="0"/>
+          <w:numId w:val="1006"/>
+        </w:numPr>
+      </w:pPr>
+      <w:r>
+        <w:t xml:space="preserve">What would you advise if a government wanted to try and conserve Monarch butterflies?</w:t>
+      </w:r>
+    </w:p>
+    <w:p>
+      <w:pPr>
+        <w:pStyle w:val="FirstParagraph"/>
+      </w:pPr>
+      <w:r>
+        <w:t xml:space="preserve">Going back to NHST, those P-values and the associated statistical significance are maybe a bit clearer now.</w:t>
+      </w:r>
+    </w:p>
+    <w:p>
+      <w:pPr>
+        <w:pStyle w:val="BodyText"/>
+      </w:pPr>
+      <w:r>
+        <w:t xml:space="preserve">The slope for</w:t>
       </w:r>
       <w:r>
         <w:t xml:space="preserve"> </w:t>
@@ -4589,7 +4684,15 @@
         <w:pStyle w:val="BodyText"/>
       </w:pPr>
       <w:r>
-        <w:t xml:space="preserve">The question here is, what have we gained from using NHST. We can tell, just from looking at the figures above, that bigger butterflies have bigger wings, and that butterflies in Forests have bigger wings than Meadow butterflies. Whether or not you think you gain anything substantial from using NHST and P-values if up for you to decide. But personally, I don’t see much value in them, but I do see downsides to using them. So in my own work, I tend to avoid using them. That’s not to say you have to agree with me, many scientists would strongly disagree, but the point is that you don’t</w:t>
+        <w:t xml:space="preserve">The question here is, what have we gained from using NHST? We can tell just from looking at the figures above, that bigger butterflies have bigger wings, and that butterflies in Forests have bigger wings than Meadow and Wetland butterflies. Do we really need a P-value to tell us that? Imagine a similar scenario where we have statistical significance, but the difference in wing length was 0.001 mm. Are we going to claim that a 0.001 mm difference is important just because it’s statistically significant?</w:t>
+      </w:r>
+    </w:p>
+    <w:p>
+      <w:pPr>
+        <w:pStyle w:val="BodyText"/>
+      </w:pPr>
+      <w:r>
+        <w:t xml:space="preserve">Whether or not you think you gain anything substantial from using NHST and P-values is up for you to decide. But personally, I don’t see a huge amount of value in them, but I do see definite downsides to using them (for examples, see the papers in today’s MyAberdeen workshop folder - just give them very quick skims so you get the point). So in my own work, I tend to avoid using them. That’s not to say you have to agree with me, many scientists would strongly disagree with good arguments (but others would also disagree with terrible arguments), but the point is that you don’t</w:t>
       </w:r>
       <w:r>
         <w:t xml:space="preserve"> </w:t>
@@ -4605,11 +4708,12 @@
         <w:t xml:space="preserve"> </w:t>
       </w:r>
       <w:r>
-        <w:t xml:space="preserve">to use them and if you do use them, you need to be very confident in what you’re doing as it’s all too easy to use them inappropriately.</w:t>
+        <w:t xml:space="preserve">to use them and if you do use them, you need to be very confident in what you’re doing as it’s all too easy to use them inappropriately. After all, you don’t want to write a paper claiming that you’ve got irrefutable evidence of psychic powers because your result is statistically significant (seriously, skim those papers on MyAberdeen, they’re crazy).</w:t>
       </w:r>
     </w:p>
     <w:bookmarkEnd w:id="42"/>
-    <w:bookmarkStart w:id="43" w:name="an-akaikes-information-criterion"/>
+    <w:bookmarkEnd w:id="43"/>
+    <w:bookmarkStart w:id="45" w:name="an-akaikes-information-criterion"/>
     <w:p>
       <w:pPr>
         <w:pStyle w:val="Heading1"/>
@@ -4632,7 +4736,7 @@
         <w:t xml:space="preserve">“</w:t>
       </w:r>
       <w:r>
-        <w:t xml:space="preserve">unneccessary</w:t>
+        <w:t xml:space="preserve">unnecessary</w:t>
       </w:r>
       <w:r>
         <w:t xml:space="preserve">”</w:t>
@@ -4684,7 +4788,7 @@
         <w:t xml:space="preserve">drop</w:t>
       </w:r>
       <w:r>
-        <w:t xml:space="preserve">()` function is that it can be pretty counterintuitive to use - I personally have to stop and think carefully whenever I use it because it just doesn’t work the way my brain thinks it does. The downside of fitting the models ourselves is that this can take a fair amount of time to do. I actually don’t mind that though, as fitting the models yourself means your less likely to fit something you don’t care about (or go</w:t>
+        <w:t xml:space="preserve">()` function is that it can be pretty counter-intuitive to use - I personally have to stop and think carefully whenever I use it because it just doesn’t work the way my brain thinks it does. The downside of fitting the models ourselves is that this can take a fair amount of time to do. I actually don’t mind that though, as fitting the models yourself means your less likely to fit something you don’t care about (or go</w:t>
       </w:r>
       <w:r>
         <w:t xml:space="preserve"> </w:t>
@@ -4765,10 +4869,21 @@
     </w:p>
     <w:p>
       <w:pPr>
+        <w:pStyle w:val="SourceCode"/>
+      </w:pPr>
+      <w:r>
+        <w:rPr>
+          <w:rStyle w:val="VerbatimChar"/>
+        </w:rPr>
+        <w:t xml:space="preserve">## [1] 834.887</w:t>
+      </w:r>
+    </w:p>
+    <w:p>
+      <w:pPr>
         <w:pStyle w:val="FirstParagraph"/>
       </w:pPr>
       <w:r>
-        <w:t xml:space="preserve">And we get an AIC value of 836.0182508. In and of itself, that tells us nothing. Remember that AIC is used to compare between two or more models, so just having the AIC for a single model means nothing.</w:t>
+        <w:t xml:space="preserve">And we get an AIC value of 834.8869996. In and of itself, that tells us nothing. Remember that AIC is used to compare between two or more models, so just having the AIC for a single model means nothing.</w:t>
       </w:r>
     </w:p>
     <w:p>
@@ -4892,10 +5007,21 @@
     </w:p>
     <w:p>
       <w:pPr>
+        <w:pStyle w:val="SourceCode"/>
+      </w:pPr>
+      <w:r>
+        <w:rPr>
+          <w:rStyle w:val="VerbatimChar"/>
+        </w:rPr>
+        <w:t xml:space="preserve">## [1] 1077.874</w:t>
+      </w:r>
+    </w:p>
+    <w:p>
+      <w:pPr>
         <w:pStyle w:val="FirstParagraph"/>
       </w:pPr>
       <w:r>
-        <w:t xml:space="preserve">Our AIC is now 1079.5804332, and increase of 243.5621823 (or if we want to be fancy, we could write</w:t>
+        <w:t xml:space="preserve">Our AIC is now 1077.8744571, and increase of 242.9874575 (or if we want to be fancy, we could write</w:t>
       </w:r>
       <w:r>
         <w:t xml:space="preserve"> </w:t>
@@ -4924,7 +5050,7 @@
         <w:t xml:space="preserve"> </w:t>
       </w:r>
       <w:r>
-        <w:t xml:space="preserve">243.5621823). Remember that we want AIC to be as low as possible, so of the two models we’ve now run, the first model is a substantially</w:t>
+        <w:t xml:space="preserve">242.9874575). Remember that we want AIC to be as low as possible, so of the two models we’ve now run, the first model is a substantially</w:t>
       </w:r>
       <w:r>
         <w:t xml:space="preserve"> </w:t>
@@ -5487,10 +5613,93 @@
     </w:p>
     <w:p>
       <w:pPr>
+        <w:pStyle w:val="SourceCode"/>
+      </w:pPr>
+      <w:r>
+        <w:rPr>
+          <w:rStyle w:val="VerbatimChar"/>
+        </w:rPr>
+        <w:t xml:space="preserve">##                     df       AIC</w:t>
+      </w:r>
+      <w:r>
+        <w:br/>
+      </w:r>
+      <w:r>
+        <w:rPr>
+          <w:rStyle w:val="VerbatimChar"/>
+        </w:rPr>
+        <w:t xml:space="preserve">## butter_mod           6  834.8870</w:t>
+      </w:r>
+      <w:r>
+        <w:br/>
+      </w:r>
+      <w:r>
+        <w:rPr>
+          <w:rStyle w:val="VerbatimChar"/>
+        </w:rPr>
+        <w:t xml:space="preserve">## butter_mod_no_body   5 1077.8745</w:t>
+      </w:r>
+      <w:r>
+        <w:br/>
+      </w:r>
+      <w:r>
+        <w:rPr>
+          <w:rStyle w:val="VerbatimChar"/>
+        </w:rPr>
+        <w:t xml:space="preserve">## butter_mod_no_glyph  5  832.9194</w:t>
+      </w:r>
+      <w:r>
+        <w:br/>
+      </w:r>
+      <w:r>
+        <w:rPr>
+          <w:rStyle w:val="VerbatimChar"/>
+        </w:rPr>
+        <w:t xml:space="preserve">## butter_mod_no_hab    4  854.4638</w:t>
+      </w:r>
+      <w:r>
+        <w:br/>
+      </w:r>
+      <w:r>
+        <w:rPr>
+          <w:rStyle w:val="VerbatimChar"/>
+        </w:rPr>
+        <w:t xml:space="preserve">## butter_mod_body      3  852.6127</w:t>
+      </w:r>
+      <w:r>
+        <w:br/>
+      </w:r>
+      <w:r>
+        <w:rPr>
+          <w:rStyle w:val="VerbatimChar"/>
+        </w:rPr>
+        <w:t xml:space="preserve">## butter_mod_glyph     3 1086.5455</w:t>
+      </w:r>
+      <w:r>
+        <w:br/>
+      </w:r>
+      <w:r>
+        <w:rPr>
+          <w:rStyle w:val="VerbatimChar"/>
+        </w:rPr>
+        <w:t xml:space="preserve">## butter_mod_hab       4 1076.2362</w:t>
+      </w:r>
+      <w:r>
+        <w:br/>
+      </w:r>
+      <w:r>
+        <w:rPr>
+          <w:rStyle w:val="VerbatimChar"/>
+        </w:rPr>
+        <w:t xml:space="preserve">## butter_mod_null      2 1084.7269</w:t>
+      </w:r>
+    </w:p>
+    <w:p>
+      <w:pPr>
         <w:pStyle w:val="FirstParagraph"/>
       </w:pPr>
       <w:r>
-        <w:t xml:space="preserve">Now we just need to find the models where the AIC is within 2 units of the absolute lowest AIC value. Our lowest AIC is 852.6127 for the model that only included body length, but we have another model with an AIC of 832.9194, which is within 2 AIC units - the model which had body length and habitat.</w:t>
+        <w:t xml:space="preserve">Now we just need to find the models where the AIC is within 2 units of the absolute lowest AIC value. Our lowest AIC is 832.9 for the model that included body length and habitat.</w:t>
       </w:r>
     </w:p>
     <w:p>
@@ -5498,38 +5707,52 @@
         <w:pStyle w:val="BodyText"/>
       </w:pPr>
       <w:r>
-        <w:t xml:space="preserve">So we have two models which we would deem to be broadly equivalent judging by AIC. At this point, there are a number of options as to how to choose which model should be reported. These include:</w:t>
+        <w:t xml:space="preserve">In cases where we have two or more models which we would deem to be broadly equivalent judging by AIC (i.e. where the difference (or</w:t>
+      </w:r>
+      <w:r>
+        <w:t xml:space="preserve"> </w:t>
+      </w:r>
+      <m:oMath>
+        <m:r>
+          <m:t>Δ</m:t>
+        </m:r>
+      </m:oMath>
+      <w:r>
+        <w:t xml:space="preserve"> </w:t>
+      </w:r>
+      <w:r>
+        <w:t xml:space="preserve">is less than or equal to 2), there are a number of options as to how to choose which model should be interpreted and reported. These include:</w:t>
       </w:r>
     </w:p>
     <w:p>
       <w:pPr>
         <w:numPr>
           <w:ilvl w:val="0"/>
-          <w:numId w:val="1008"/>
+          <w:numId w:val="1007"/>
         </w:numPr>
         <w:pStyle w:val="Compact"/>
       </w:pPr>
       <w:r>
-        <w:t xml:space="preserve">Select the model with the absolute lowest AIC and report on this only.</w:t>
+        <w:t xml:space="preserve">Select the model with the absolute lowest AIC and report on this model only.</w:t>
       </w:r>
     </w:p>
     <w:p>
       <w:pPr>
         <w:numPr>
           <w:ilvl w:val="0"/>
-          <w:numId w:val="1008"/>
+          <w:numId w:val="1007"/>
         </w:numPr>
         <w:pStyle w:val="Compact"/>
       </w:pPr>
       <w:r>
-        <w:t xml:space="preserve">Of the models within 2 AIC units, select the one which best answers your research question.</w:t>
+        <w:t xml:space="preserve">Of the models within 2 AIC units, select and report on the one which best answers your research question.</w:t>
       </w:r>
     </w:p>
     <w:p>
       <w:pPr>
         <w:numPr>
           <w:ilvl w:val="0"/>
-          <w:numId w:val="1008"/>
+          <w:numId w:val="1007"/>
         </w:numPr>
         <w:pStyle w:val="Compact"/>
       </w:pPr>
@@ -5542,7 +5765,105 @@
         <w:pStyle w:val="FirstParagraph"/>
       </w:pPr>
       <w:r>
-        <w:t xml:space="preserve">There is no clear answer for which option is to be preferred, so the choice is yours to make.</w:t>
+        <w:t xml:space="preserve">There is no clear answer for which option is to be preferred, so the choice is yours to make. Whichever model you choose though, you would complete the final steps; diagnose, summarise and interpret.</w:t>
+      </w:r>
+    </w:p>
+    <w:bookmarkStart w:id="44" w:name="automate-aic"/>
+    <w:p>
+      <w:pPr>
+        <w:pStyle w:val="Heading2"/>
+      </w:pPr>
+      <w:r>
+        <w:t xml:space="preserve">Automate AIC</w:t>
+      </w:r>
+    </w:p>
+    <w:p>
+      <w:pPr>
+        <w:pStyle w:val="FirstParagraph"/>
+      </w:pPr>
+      <w:r>
+        <w:t xml:space="preserve">While we can go through this process of running each model</w:t>
+      </w:r>
+      <w:r>
+        <w:t xml:space="preserve"> </w:t>
+      </w:r>
+      <w:r>
+        <w:t xml:space="preserve">“</w:t>
+      </w:r>
+      <w:r>
+        <w:t xml:space="preserve">by hand</w:t>
+      </w:r>
+      <w:r>
+        <w:t xml:space="preserve">”</w:t>
+      </w:r>
+      <w:r>
+        <w:t xml:space="preserve">, it’s a bit of a pain, especially if we have lots of explanatory variables in our model. An alternative is to use an automated process (it’s not complicated after all, just time consuming). There are a few options to do this, but the one we’ll show here involves using a package that comes pre-installed whenever you download</w:t>
+      </w:r>
+      <w:r>
+        <w:t xml:space="preserve"> </w:t>
+      </w:r>
+      <w:r>
+        <w:rPr>
+          <w:rStyle w:val="VerbatimChar"/>
+        </w:rPr>
+        <w:t xml:space="preserve">R</w:t>
+      </w:r>
+      <w:r>
+        <w:t xml:space="preserve"> </w:t>
+      </w:r>
+      <w:r>
+        <w:t xml:space="preserve">called</w:t>
+      </w:r>
+      <w:r>
+        <w:t xml:space="preserve"> </w:t>
+      </w:r>
+      <w:r>
+        <w:rPr>
+          <w:rStyle w:val="VerbatimChar"/>
+        </w:rPr>
+        <w:t xml:space="preserve">MASS</w:t>
+      </w:r>
+      <w:r>
+        <w:t xml:space="preserve">. Within</w:t>
+      </w:r>
+      <w:r>
+        <w:t xml:space="preserve"> </w:t>
+      </w:r>
+      <w:r>
+        <w:rPr>
+          <w:rStyle w:val="VerbatimChar"/>
+        </w:rPr>
+        <w:t xml:space="preserve">MASS</w:t>
+      </w:r>
+      <w:r>
+        <w:t xml:space="preserve">, the function we want to use is called</w:t>
+      </w:r>
+      <w:r>
+        <w:t xml:space="preserve"> </w:t>
+      </w:r>
+      <w:r>
+        <w:rPr>
+          <w:rStyle w:val="VerbatimChar"/>
+        </w:rPr>
+        <w:t xml:space="preserve">stepAIC()</w:t>
+      </w:r>
+      <w:r>
+        <w:t xml:space="preserve">. The way</w:t>
+      </w:r>
+      <w:r>
+        <w:t xml:space="preserve"> </w:t>
+      </w:r>
+      <w:r>
+        <w:rPr>
+          <w:rStyle w:val="VerbatimChar"/>
+        </w:rPr>
+        <w:t xml:space="preserve">stepAIC()</w:t>
+      </w:r>
+      <w:r>
+        <w:t xml:space="preserve"> </w:t>
+      </w:r>
+      <w:r>
+        <w:t xml:space="preserve">works is that we supply our most complex model (the model with all of the explanatory variables we can include) and let the machinery take care of the rest.</w:t>
       </w:r>
     </w:p>
     <w:p>
@@ -5550,7 +5871,37 @@
         <w:pStyle w:val="BodyText"/>
       </w:pPr>
       <w:r>
-        <w:t xml:space="preserve">Whichever model you choose though, you would complete the final steps; diagnose, summarise and interpret.</w:t>
+        <w:t xml:space="preserve">An important note is that</w:t>
+      </w:r>
+      <w:r>
+        <w:t xml:space="preserve"> </w:t>
+      </w:r>
+      <w:r>
+        <w:rPr>
+          <w:rStyle w:val="VerbatimChar"/>
+        </w:rPr>
+        <w:t xml:space="preserve">stepAIC()</w:t>
+      </w:r>
+      <w:r>
+        <w:t xml:space="preserve"> </w:t>
+      </w:r>
+      <w:r>
+        <w:t xml:space="preserve">uses a slightly different way to calculate AIC compared to the</w:t>
+      </w:r>
+      <w:r>
+        <w:t xml:space="preserve"> </w:t>
+      </w:r>
+      <w:r>
+        <w:rPr>
+          <w:rStyle w:val="VerbatimChar"/>
+        </w:rPr>
+        <w:t xml:space="preserve">AIC()</w:t>
+      </w:r>
+      <w:r>
+        <w:t xml:space="preserve"> </w:t>
+      </w:r>
+      <w:r>
+        <w:t xml:space="preserve">function. It’s largely just pedantic and technical differences, but the important thing is that it doesn’t really matter how we calculate AIC. The end result will, in 99% of cases, be the same end result (i.e. the final model we choose).</w:t>
       </w:r>
     </w:p>
     <w:p>
@@ -5558,19 +5909,7 @@
         <w:pStyle w:val="BodyText"/>
       </w:pPr>
       <w:r>
-        <w:t xml:space="preserve">While we can do this by hand, we could always use</w:t>
-      </w:r>
-      <w:r>
-        <w:t xml:space="preserve"> </w:t>
-      </w:r>
-      <w:r>
-        <w:rPr>
-          <w:rStyle w:val="VerbatimChar"/>
-        </w:rPr>
-        <w:t xml:space="preserve">drop1()</w:t>
-      </w:r>
-      <w:r>
-        <w:t xml:space="preserve">. Here’s what that would look like:</w:t>
+        <w:t xml:space="preserve">Here’s what that would look like:</w:t>
       </w:r>
     </w:p>
     <w:p>
@@ -5581,7 +5920,28 @@
         <w:rPr>
           <w:rStyle w:val="FunctionTok"/>
         </w:rPr>
-        <w:t xml:space="preserve">drop1</w:t>
+        <w:t xml:space="preserve">library</w:t>
+      </w:r>
+      <w:r>
+        <w:rPr>
+          <w:rStyle w:val="NormalTok"/>
+        </w:rPr>
+        <w:t xml:space="preserve">(MASS) </w:t>
+      </w:r>
+      <w:r>
+        <w:rPr>
+          <w:rStyle w:val="CommentTok"/>
+        </w:rPr>
+        <w:t xml:space="preserve"># load the MASS package</w:t>
+      </w:r>
+      <w:r>
+        <w:br/>
+      </w:r>
+      <w:r>
+        <w:rPr>
+          <w:rStyle w:val="FunctionTok"/>
+        </w:rPr>
+        <w:t xml:space="preserve">stepAIC</w:t>
       </w:r>
       <w:r>
         <w:rPr>
@@ -5590,8 +5950,374 @@
         <w:t xml:space="preserve">(butter_mod)</w:t>
       </w:r>
     </w:p>
-    <w:bookmarkEnd w:id="43"/>
-    <w:bookmarkStart w:id="44" w:name="the-difference-between-nhst-and-aic"/>
+    <w:p>
+      <w:pPr>
+        <w:pStyle w:val="SourceCode"/>
+      </w:pPr>
+      <w:r>
+        <w:rPr>
+          <w:rStyle w:val="VerbatimChar"/>
+        </w:rPr>
+        <w:t xml:space="preserve">## Start:  AIC=265.31</w:t>
+      </w:r>
+      <w:r>
+        <w:br/>
+      </w:r>
+      <w:r>
+        <w:rPr>
+          <w:rStyle w:val="VerbatimChar"/>
+        </w:rPr>
+        <w:t xml:space="preserve">## wing_length ~ body_length + glyphosate + habitat</w:t>
+      </w:r>
+      <w:r>
+        <w:br/>
+      </w:r>
+      <w:r>
+        <w:rPr>
+          <w:rStyle w:val="VerbatimChar"/>
+        </w:rPr>
+        <w:t xml:space="preserve">## </w:t>
+      </w:r>
+      <w:r>
+        <w:br/>
+      </w:r>
+      <w:r>
+        <w:rPr>
+          <w:rStyle w:val="VerbatimChar"/>
+        </w:rPr>
+        <w:t xml:space="preserve">##               Df Sum of Sq     RSS    AIC</w:t>
+      </w:r>
+      <w:r>
+        <w:br/>
+      </w:r>
+      <w:r>
+        <w:rPr>
+          <w:rStyle w:val="VerbatimChar"/>
+        </w:rPr>
+        <w:t xml:space="preserve">## - glyphosate   1      0.12  716.97 263.34</w:t>
+      </w:r>
+      <w:r>
+        <w:br/>
+      </w:r>
+      <w:r>
+        <w:rPr>
+          <w:rStyle w:val="VerbatimChar"/>
+        </w:rPr>
+        <w:t xml:space="preserve">## &lt;none&gt;                      716.86 265.31</w:t>
+      </w:r>
+      <w:r>
+        <w:br/>
+      </w:r>
+      <w:r>
+        <w:rPr>
+          <w:rStyle w:val="VerbatimChar"/>
+        </w:rPr>
+        <w:t xml:space="preserve">## - habitat      2     89.69  806.54 284.89</w:t>
+      </w:r>
+      <w:r>
+        <w:br/>
+      </w:r>
+      <w:r>
+        <w:rPr>
+          <w:rStyle w:val="VerbatimChar"/>
+        </w:rPr>
+        <w:t xml:space="preserve">## - body_length  1   1723.29 2440.14 508.30</w:t>
+      </w:r>
+      <w:r>
+        <w:br/>
+      </w:r>
+      <w:r>
+        <w:rPr>
+          <w:rStyle w:val="VerbatimChar"/>
+        </w:rPr>
+        <w:t xml:space="preserve">## </w:t>
+      </w:r>
+      <w:r>
+        <w:br/>
+      </w:r>
+      <w:r>
+        <w:rPr>
+          <w:rStyle w:val="VerbatimChar"/>
+        </w:rPr>
+        <w:t xml:space="preserve">## Step:  AIC=263.34</w:t>
+      </w:r>
+      <w:r>
+        <w:br/>
+      </w:r>
+      <w:r>
+        <w:rPr>
+          <w:rStyle w:val="VerbatimChar"/>
+        </w:rPr>
+        <w:t xml:space="preserve">## wing_length ~ body_length + habitat</w:t>
+      </w:r>
+      <w:r>
+        <w:br/>
+      </w:r>
+      <w:r>
+        <w:rPr>
+          <w:rStyle w:val="VerbatimChar"/>
+        </w:rPr>
+        <w:t xml:space="preserve">## </w:t>
+      </w:r>
+      <w:r>
+        <w:br/>
+      </w:r>
+      <w:r>
+        <w:rPr>
+          <w:rStyle w:val="VerbatimChar"/>
+        </w:rPr>
+        <w:t xml:space="preserve">##               Df Sum of Sq     RSS    AIC</w:t>
+      </w:r>
+      <w:r>
+        <w:br/>
+      </w:r>
+      <w:r>
+        <w:rPr>
+          <w:rStyle w:val="VerbatimChar"/>
+        </w:rPr>
+        <w:t xml:space="preserve">## &lt;none&gt;                      716.97 263.34</w:t>
+      </w:r>
+      <w:r>
+        <w:br/>
+      </w:r>
+      <w:r>
+        <w:rPr>
+          <w:rStyle w:val="VerbatimChar"/>
+        </w:rPr>
+        <w:t xml:space="preserve">## - habitat      2     90.17  807.15 283.04</w:t>
+      </w:r>
+      <w:r>
+        <w:br/>
+      </w:r>
+      <w:r>
+        <w:rPr>
+          <w:rStyle w:val="VerbatimChar"/>
+        </w:rPr>
+        <w:t xml:space="preserve">## - body_length  1   1727.59 2444.56 506.66</w:t>
+      </w:r>
+    </w:p>
+    <w:p>
+      <w:pPr>
+        <w:pStyle w:val="SourceCode"/>
+      </w:pPr>
+      <w:r>
+        <w:rPr>
+          <w:rStyle w:val="VerbatimChar"/>
+        </w:rPr>
+        <w:t xml:space="preserve">## </w:t>
+      </w:r>
+      <w:r>
+        <w:br/>
+      </w:r>
+      <w:r>
+        <w:rPr>
+          <w:rStyle w:val="VerbatimChar"/>
+        </w:rPr>
+        <w:t xml:space="preserve">## Call:</w:t>
+      </w:r>
+      <w:r>
+        <w:br/>
+      </w:r>
+      <w:r>
+        <w:rPr>
+          <w:rStyle w:val="VerbatimChar"/>
+        </w:rPr>
+        <w:t xml:space="preserve">## lm(formula = wing_length ~ body_length + habitat, data = butterfly)</w:t>
+      </w:r>
+      <w:r>
+        <w:br/>
+      </w:r>
+      <w:r>
+        <w:rPr>
+          <w:rStyle w:val="VerbatimChar"/>
+        </w:rPr>
+        <w:t xml:space="preserve">## </w:t>
+      </w:r>
+      <w:r>
+        <w:br/>
+      </w:r>
+      <w:r>
+        <w:rPr>
+          <w:rStyle w:val="VerbatimChar"/>
+        </w:rPr>
+        <w:t xml:space="preserve">## Coefficients:</w:t>
+      </w:r>
+      <w:r>
+        <w:br/>
+      </w:r>
+      <w:r>
+        <w:rPr>
+          <w:rStyle w:val="VerbatimChar"/>
+        </w:rPr>
+        <w:t xml:space="preserve">##    (Intercept)     body_length   habitatMeadow  habitatWetland  </w:t>
+      </w:r>
+      <w:r>
+        <w:br/>
+      </w:r>
+      <w:r>
+        <w:rPr>
+          <w:rStyle w:val="VerbatimChar"/>
+        </w:rPr>
+        <w:t xml:space="preserve">##        -1.2002          0.5766         -1.5529         -1.3124</w:t>
+      </w:r>
+    </w:p>
+    <w:p>
+      <w:pPr>
+        <w:pStyle w:val="FirstParagraph"/>
+      </w:pPr>
+      <w:r>
+        <w:t xml:space="preserve">The output can look a bit intimidating at first, but it’s basically doing the same thing we did before (just slightly smarter). The first part of the output tells us the AIC of our starting model (</w:t>
+      </w:r>
+      <w:r>
+        <w:rPr>
+          <w:rStyle w:val="VerbatimChar"/>
+        </w:rPr>
+        <w:t xml:space="preserve">Start:  AIC=266.44</w:t>
+      </w:r>
+      <w:r>
+        <w:t xml:space="preserve">). Then</w:t>
+      </w:r>
+      <w:r>
+        <w:t xml:space="preserve"> </w:t>
+      </w:r>
+      <w:r>
+        <w:rPr>
+          <w:rStyle w:val="VerbatimChar"/>
+        </w:rPr>
+        <w:t xml:space="preserve">stepAIC()</w:t>
+      </w:r>
+      <w:r>
+        <w:t xml:space="preserve"> </w:t>
+      </w:r>
+      <w:r>
+        <w:t xml:space="preserve">attempts to remove each explanatory variable in turn (e.g. </w:t>
+      </w:r>
+      <w:r>
+        <w:rPr>
+          <w:rStyle w:val="VerbatimChar"/>
+        </w:rPr>
+        <w:t xml:space="preserve">- glyphosate</w:t>
+      </w:r>
+      <w:r>
+        <w:t xml:space="preserve"> </w:t>
+      </w:r>
+      <w:r>
+        <w:t xml:space="preserve">is where glyphosate is removed, hence the minus) but also considers when it doesn’t remove any (i.e. </w:t>
+      </w:r>
+      <w:r>
+        <w:rPr>
+          <w:rStyle w:val="VerbatimChar"/>
+        </w:rPr>
+        <w:t xml:space="preserve">&lt;none&gt;</w:t>
+      </w:r>
+      <w:r>
+        <w:t xml:space="preserve"> </w:t>
+      </w:r>
+      <w:r>
+        <w:t xml:space="preserve">where no variables are removed). At this point,</w:t>
+      </w:r>
+      <w:r>
+        <w:t xml:space="preserve"> </w:t>
+      </w:r>
+      <w:r>
+        <w:rPr>
+          <w:rStyle w:val="VerbatimChar"/>
+        </w:rPr>
+        <w:t xml:space="preserve">stepAIC()</w:t>
+      </w:r>
+      <w:r>
+        <w:t xml:space="preserve"> </w:t>
+      </w:r>
+      <w:r>
+        <w:t xml:space="preserve">looks for the lowest AIC of the models it has run, in this case, that’s when glyphosate is removed. Remember, AIC</w:t>
+      </w:r>
+      <w:r>
+        <w:t xml:space="preserve"> </w:t>
+      </w:r>
+      <w:r>
+        <w:t xml:space="preserve">“</w:t>
+      </w:r>
+      <w:r>
+        <w:t xml:space="preserve">improves</w:t>
+      </w:r>
+      <w:r>
+        <w:t xml:space="preserve">”</w:t>
+      </w:r>
+      <w:r>
+        <w:t xml:space="preserve"> </w:t>
+      </w:r>
+      <w:r>
+        <w:t xml:space="preserve">when it is lowered, so if we remove glyphosate and AIC drops, then that implies an</w:t>
+      </w:r>
+      <w:r>
+        <w:t xml:space="preserve"> </w:t>
+      </w:r>
+      <w:r>
+        <w:t xml:space="preserve">“</w:t>
+      </w:r>
+      <w:r>
+        <w:t xml:space="preserve">improvement</w:t>
+      </w:r>
+      <w:r>
+        <w:t xml:space="preserve">”</w:t>
+      </w:r>
+      <w:r>
+        <w:t xml:space="preserve">.</w:t>
+      </w:r>
+    </w:p>
+    <w:p>
+      <w:pPr>
+        <w:pStyle w:val="BodyText"/>
+      </w:pPr>
+      <w:r>
+        <w:t xml:space="preserve">Having then removed any variables that result in improved AIC, it repeats this process, attempting to remove any explanatory variables that lower AIC. In this example, however, removing either</w:t>
+      </w:r>
+      <w:r>
+        <w:t xml:space="preserve"> </w:t>
+      </w:r>
+      <w:r>
+        <w:rPr>
+          <w:rStyle w:val="VerbatimChar"/>
+        </w:rPr>
+        <w:t xml:space="preserve">habitat</w:t>
+      </w:r>
+      <w:r>
+        <w:t xml:space="preserve"> </w:t>
+      </w:r>
+      <w:r>
+        <w:t xml:space="preserve">or</w:t>
+      </w:r>
+      <w:r>
+        <w:t xml:space="preserve"> </w:t>
+      </w:r>
+      <w:r>
+        <w:rPr>
+          <w:rStyle w:val="VerbatimChar"/>
+        </w:rPr>
+        <w:t xml:space="preserve">body_length</w:t>
+      </w:r>
+      <w:r>
+        <w:t xml:space="preserve"> </w:t>
+      </w:r>
+      <w:r>
+        <w:t xml:space="preserve">result in increased AIC values, so we shouldn’t remove these, and we’re left with our final model, which is</w:t>
+      </w:r>
+      <w:r>
+        <w:t xml:space="preserve"> </w:t>
+      </w:r>
+      <w:r>
+        <w:rPr>
+          <w:rStyle w:val="VerbatimChar"/>
+        </w:rPr>
+        <w:t xml:space="preserve">wing_length ~ body_length + habitat</w:t>
+      </w:r>
+      <w:r>
+        <w:t xml:space="preserve">.</w:t>
+      </w:r>
+    </w:p>
+    <w:bookmarkEnd w:id="44"/>
+    <w:bookmarkEnd w:id="45"/>
+    <w:bookmarkStart w:id="46" w:name="the-difference-between-nhst-and-aic"/>
     <w:p>
       <w:pPr>
         <w:pStyle w:val="Heading1"/>
@@ -5658,8 +6384,8 @@
         <w:t xml:space="preserve">or retained by AIC.</w:t>
       </w:r>
     </w:p>
-    <w:bookmarkEnd w:id="44"/>
-    <w:bookmarkStart w:id="45" w:name="the-next-challenger"/>
+    <w:bookmarkEnd w:id="46"/>
+    <w:bookmarkStart w:id="47" w:name="the-next-challenger"/>
     <w:p>
       <w:pPr>
         <w:pStyle w:val="Heading1"/>
@@ -5673,11 +6399,11 @@
         <w:pStyle w:val="FirstParagraph"/>
       </w:pPr>
       <w:r>
-        <w:t xml:space="preserve">If you’ve managed to get to the end, then feel free to take a well earned break. If you feel up to it, you’re welcome to go back to any of the models you’ve run in previous workshops and test out NHST and AIC to see what they say about the models you’ve already run.</w:t>
-      </w:r>
-    </w:p>
-    <w:bookmarkEnd w:id="45"/>
-    <w:bookmarkStart w:id="46" w:name="assumption-table"/>
+        <w:t xml:space="preserve">If you’ve managed to get to the end, then feel free to take a well earned break. If you feel up to it, go back to the flat price dataset and the model where we were trying to predict rent price and use NHST and AIC to see 1) which explanatory variables are significant and 2) which variables can be removed to make the predictive model more efficient.</w:t>
+      </w:r>
+    </w:p>
+    <w:bookmarkEnd w:id="47"/>
+    <w:bookmarkStart w:id="48" w:name="assumption-table"/>
     <w:p>
       <w:pPr>
         <w:pStyle w:val="Heading1"/>
@@ -5692,7 +6418,6 @@
         <w:tblW w:type="pct" w:w="5000"/>
         <w:tblLook w:firstRow="1" w:lastRow="0" w:firstColumn="0" w:lastColumn="0" w:noHBand="0" w:noVBand="0" w:val="0020"/>
         <w:jc w:val="start"/>
-        <w:tblLayout w:type="fixed"/>
       </w:tblPr>
       <w:tblGrid>
         <w:gridCol w:w="856"/>
@@ -6101,7 +6826,7 @@
         </w:tc>
       </w:tr>
     </w:tbl>
-    <w:bookmarkEnd w:id="46"/>
+    <w:bookmarkEnd w:id="48"/>
     <w:sectPr>
       <w:pgSz w:h="15840" w:w="12240"/>
       <w:pgMar w:bottom="1440" w:footer="720" w:gutter="0" w:header="720" w:left="1440" w:right="1440" w:top="1440"/>
@@ -6537,85 +7262,76 @@
       </w:pPr>
     </w:lvl>
   </w:abstractNum>
-  <w:abstractNum w:abstractNumId="99413">
-    <w:nsid w:val="A99413"/>
+  <w:abstractNum w:abstractNumId="991">
+    <w:nsid w:val="A991"/>
     <w:multiLevelType w:val="multilevel"/>
     <w:lvl w:ilvl="0">
-      <w:start w:val="3"/>
-      <w:numFmt w:val="decimal"/>
-      <w:lvlText w:val="%1."/>
+      <w:numFmt w:val="bullet"/>
+      <w:lvlText w:val="•"/>
       <w:lvlJc w:val="left"/>
       <w:pPr>
         <w:ind w:left="720" w:hanging="480"/>
       </w:pPr>
     </w:lvl>
     <w:lvl w:ilvl="1">
-      <w:start w:val="3"/>
-      <w:numFmt w:val="decimal"/>
-      <w:lvlText w:val="%2."/>
+      <w:numFmt w:val="bullet"/>
+      <w:lvlText w:val="–"/>
       <w:lvlJc w:val="left"/>
       <w:pPr>
         <w:ind w:left="1440" w:hanging="480"/>
       </w:pPr>
     </w:lvl>
     <w:lvl w:ilvl="2">
-      <w:start w:val="3"/>
-      <w:numFmt w:val="decimal"/>
-      <w:lvlText w:val="%3."/>
+      <w:numFmt w:val="bullet"/>
+      <w:lvlText w:val="•"/>
       <w:lvlJc w:val="left"/>
       <w:pPr>
         <w:ind w:left="2160" w:hanging="480"/>
       </w:pPr>
     </w:lvl>
     <w:lvl w:ilvl="3">
-      <w:start w:val="3"/>
-      <w:numFmt w:val="decimal"/>
-      <w:lvlText w:val="%4."/>
+      <w:numFmt w:val="bullet"/>
+      <w:lvlText w:val="–"/>
       <w:lvlJc w:val="left"/>
       <w:pPr>
         <w:ind w:left="2880" w:hanging="480"/>
       </w:pPr>
     </w:lvl>
     <w:lvl w:ilvl="4">
-      <w:start w:val="3"/>
-      <w:numFmt w:val="decimal"/>
-      <w:lvlText w:val="%5."/>
+      <w:numFmt w:val="bullet"/>
+      <w:lvlText w:val="•"/>
       <w:lvlJc w:val="left"/>
       <w:pPr>
         <w:ind w:left="3600" w:hanging="480"/>
       </w:pPr>
     </w:lvl>
     <w:lvl w:ilvl="5">
-      <w:start w:val="3"/>
-      <w:numFmt w:val="decimal"/>
-      <w:lvlText w:val="%6."/>
+      <w:numFmt w:val="bullet"/>
+      <w:lvlText w:val="–"/>
       <w:lvlJc w:val="left"/>
       <w:pPr>
         <w:ind w:left="4320" w:hanging="480"/>
       </w:pPr>
     </w:lvl>
     <w:lvl w:ilvl="6">
-      <w:start w:val="3"/>
-      <w:numFmt w:val="decimal"/>
-      <w:lvlText w:val="%7."/>
+      <w:numFmt w:val="bullet"/>
+      <w:lvlText w:val="•"/>
       <w:lvlJc w:val="left"/>
       <w:pPr>
         <w:ind w:left="5040" w:hanging="480"/>
       </w:pPr>
     </w:lvl>
     <w:lvl w:ilvl="7">
-      <w:start w:val="3"/>
-      <w:numFmt w:val="decimal"/>
-      <w:lvlText w:val="%8."/>
+      <w:numFmt w:val="bullet"/>
+      <w:lvlText w:val="–"/>
       <w:lvlJc w:val="left"/>
       <w:pPr>
         <w:ind w:left="5760" w:hanging="480"/>
       </w:pPr>
     </w:lvl>
     <w:lvl w:ilvl="8">
-      <w:start w:val="3"/>
-      <w:numFmt w:val="decimal"/>
-      <w:lvlText w:val="%9."/>
+      <w:numFmt w:val="bullet"/>
+      <w:lvlText w:val="•"/>
       <w:lvlJc w:val="left"/>
       <w:pPr>
         <w:ind w:left="6480" w:hanging="480"/>
@@ -6701,82 +7417,6 @@
       <w:start w:val="4"/>
       <w:numFmt w:val="decimal"/>
       <w:lvlText w:val="%9."/>
-      <w:lvlJc w:val="left"/>
-      <w:pPr>
-        <w:ind w:left="6480" w:hanging="480"/>
-      </w:pPr>
-    </w:lvl>
-  </w:abstractNum>
-  <w:abstractNum w:abstractNumId="991">
-    <w:nsid w:val="A991"/>
-    <w:multiLevelType w:val="multilevel"/>
-    <w:lvl w:ilvl="0">
-      <w:numFmt w:val="bullet"/>
-      <w:lvlText w:val="•"/>
-      <w:lvlJc w:val="left"/>
-      <w:pPr>
-        <w:ind w:left="720" w:hanging="480"/>
-      </w:pPr>
-    </w:lvl>
-    <w:lvl w:ilvl="1">
-      <w:numFmt w:val="bullet"/>
-      <w:lvlText w:val="–"/>
-      <w:lvlJc w:val="left"/>
-      <w:pPr>
-        <w:ind w:left="1440" w:hanging="480"/>
-      </w:pPr>
-    </w:lvl>
-    <w:lvl w:ilvl="2">
-      <w:numFmt w:val="bullet"/>
-      <w:lvlText w:val="•"/>
-      <w:lvlJc w:val="left"/>
-      <w:pPr>
-        <w:ind w:left="2160" w:hanging="480"/>
-      </w:pPr>
-    </w:lvl>
-    <w:lvl w:ilvl="3">
-      <w:numFmt w:val="bullet"/>
-      <w:lvlText w:val="–"/>
-      <w:lvlJc w:val="left"/>
-      <w:pPr>
-        <w:ind w:left="2880" w:hanging="480"/>
-      </w:pPr>
-    </w:lvl>
-    <w:lvl w:ilvl="4">
-      <w:numFmt w:val="bullet"/>
-      <w:lvlText w:val="•"/>
-      <w:lvlJc w:val="left"/>
-      <w:pPr>
-        <w:ind w:left="3600" w:hanging="480"/>
-      </w:pPr>
-    </w:lvl>
-    <w:lvl w:ilvl="5">
-      <w:numFmt w:val="bullet"/>
-      <w:lvlText w:val="–"/>
-      <w:lvlJc w:val="left"/>
-      <w:pPr>
-        <w:ind w:left="4320" w:hanging="480"/>
-      </w:pPr>
-    </w:lvl>
-    <w:lvl w:ilvl="6">
-      <w:numFmt w:val="bullet"/>
-      <w:lvlText w:val="•"/>
-      <w:lvlJc w:val="left"/>
-      <w:pPr>
-        <w:ind w:left="5040" w:hanging="480"/>
-      </w:pPr>
-    </w:lvl>
-    <w:lvl w:ilvl="7">
-      <w:numFmt w:val="bullet"/>
-      <w:lvlText w:val="–"/>
-      <w:lvlJc w:val="left"/>
-      <w:pPr>
-        <w:ind w:left="5760" w:hanging="480"/>
-      </w:pPr>
-    </w:lvl>
-    <w:lvl w:ilvl="8">
-      <w:numFmt w:val="bullet"/>
-      <w:lvlText w:val="•"/>
       <w:lvlJc w:val="left"/>
       <w:pPr>
         <w:ind w:left="6480" w:hanging="480"/>
@@ -6913,63 +7553,36 @@
     </w:lvlOverride>
   </w:num>
   <w:num w:numId="1004">
-    <w:abstractNumId w:val="99413"/>
+    <w:abstractNumId w:val="991"/>
+  </w:num>
+  <w:num w:numId="1005">
+    <w:abstractNumId w:val="99411"/>
     <w:lvlOverride w:ilvl="0">
-      <w:startOverride w:val="3"/>
+      <w:startOverride w:val="1"/>
     </w:lvlOverride>
     <w:lvlOverride w:ilvl="1">
-      <w:startOverride w:val="3"/>
+      <w:startOverride w:val="1"/>
     </w:lvlOverride>
     <w:lvlOverride w:ilvl="2">
-      <w:startOverride w:val="3"/>
+      <w:startOverride w:val="1"/>
     </w:lvlOverride>
     <w:lvlOverride w:ilvl="3">
-      <w:startOverride w:val="3"/>
+      <w:startOverride w:val="1"/>
     </w:lvlOverride>
     <w:lvlOverride w:ilvl="4">
-      <w:startOverride w:val="3"/>
+      <w:startOverride w:val="1"/>
     </w:lvlOverride>
     <w:lvlOverride w:ilvl="5">
-      <w:startOverride w:val="3"/>
+      <w:startOverride w:val="1"/>
     </w:lvlOverride>
     <w:lvlOverride w:ilvl="6">
-      <w:startOverride w:val="3"/>
+      <w:startOverride w:val="1"/>
     </w:lvlOverride>
     <w:lvlOverride w:ilvl="7">
-      <w:startOverride w:val="3"/>
+      <w:startOverride w:val="1"/>
     </w:lvlOverride>
     <w:lvlOverride w:ilvl="8">
-      <w:startOverride w:val="3"/>
-    </w:lvlOverride>
-  </w:num>
-  <w:num w:numId="1005">
-    <w:abstractNumId w:val="99414"/>
-    <w:lvlOverride w:ilvl="0">
-      <w:startOverride w:val="4"/>
-    </w:lvlOverride>
-    <w:lvlOverride w:ilvl="1">
-      <w:startOverride w:val="4"/>
-    </w:lvlOverride>
-    <w:lvlOverride w:ilvl="2">
-      <w:startOverride w:val="4"/>
-    </w:lvlOverride>
-    <w:lvlOverride w:ilvl="3">
-      <w:startOverride w:val="4"/>
-    </w:lvlOverride>
-    <w:lvlOverride w:ilvl="4">
-      <w:startOverride w:val="4"/>
-    </w:lvlOverride>
-    <w:lvlOverride w:ilvl="5">
-      <w:startOverride w:val="4"/>
-    </w:lvlOverride>
-    <w:lvlOverride w:ilvl="6">
-      <w:startOverride w:val="4"/>
-    </w:lvlOverride>
-    <w:lvlOverride w:ilvl="7">
-      <w:startOverride w:val="4"/>
-    </w:lvlOverride>
-    <w:lvlOverride w:ilvl="8">
-      <w:startOverride w:val="4"/>
+      <w:startOverride w:val="1"/>
     </w:lvlOverride>
   </w:num>
   <w:num w:numId="1006">
@@ -7003,9 +7616,6 @@
     </w:lvlOverride>
   </w:num>
   <w:num w:numId="1007">
-    <w:abstractNumId w:val="991"/>
-  </w:num>
-  <w:num w:numId="1008">
     <w:abstractNumId w:val="99411"/>
     <w:lvlOverride w:ilvl="0">
       <w:startOverride w:val="1"/>

</xml_diff>